<commit_message>
Priorides y etiquetas de forma global
</commit_message>
<xml_diff>
--- a/Documentacion/Plantilla Requisitos Software.docx
+++ b/Documentacion/Plantilla Requisitos Software.docx
@@ -1240,23 +1240,7 @@
                 <w:rFonts w:cs="Arial"/>
                 <w:noProof/>
               </w:rPr>
-              <w:t>Referenci</w:t>
-            </w:r>
-            <w:r>
-              <w:rPr>
-                <w:rStyle w:val="Hipervnculo"/>
-                <w:rFonts w:cs="Arial"/>
-                <w:noProof/>
-              </w:rPr>
-              <w:t>a</w:t>
-            </w:r>
-            <w:r>
-              <w:rPr>
-                <w:rStyle w:val="Hipervnculo"/>
-                <w:rFonts w:cs="Arial"/>
-                <w:noProof/>
-              </w:rPr>
-              <w:t>s</w:t>
+              <w:t>Referencias</w:t>
             </w:r>
             <w:r>
               <w:rPr>
@@ -4104,21 +4088,7 @@
                 <w:rStyle w:val="Hipervnculo"/>
                 <w:noProof/>
               </w:rPr>
-              <w:t>7. Mo</w:t>
-            </w:r>
-            <w:r>
-              <w:rPr>
-                <w:rStyle w:val="Hipervnculo"/>
-                <w:noProof/>
-              </w:rPr>
-              <w:t>c</w:t>
-            </w:r>
-            <w:r>
-              <w:rPr>
-                <w:rStyle w:val="Hipervnculo"/>
-                <w:noProof/>
-              </w:rPr>
-              <w:t>kup</w:t>
+              <w:t>7. Mockup</w:t>
             </w:r>
             <w:r>
               <w:rPr>
@@ -5023,6 +4993,7 @@
           <w:szCs w:val="24"/>
           <w:lang w:val="es-CO"/>
         </w:rPr>
+        <w:lastRenderedPageBreak/>
         <w:t>Propósito</w:t>
       </w:r>
       <w:bookmarkEnd w:id="7"/>
@@ -5423,6 +5394,7 @@
           <w:bCs/>
           <w:lang w:val="es-ES"/>
         </w:rPr>
+        <w:lastRenderedPageBreak/>
         <w:t>Escalabilidad</w:t>
       </w:r>
       <w:r>
@@ -5665,16 +5637,34 @@
         </w:rPr>
         <w:t xml:space="preserve">. </w:t>
       </w:r>
-      <w:hyperlink r:id="rId9" w:tgtFrame="_new" w:history="1">
-        <w:r>
-          <w:rPr>
-            <w:rStyle w:val="Hipervnculo"/>
-            <w:rFonts w:ascii="Arial" w:hAnsi="Arial" w:cs="Arial"/>
-            <w:lang w:val="en-US"/>
-          </w:rPr>
-          <w:t>https://www.python.org/</w:t>
-        </w:r>
-      </w:hyperlink>
+      <w:r>
+        <w:fldChar w:fldCharType="begin"/>
+      </w:r>
+      <w:r>
+        <w:rPr>
+          <w:lang w:val="en-US"/>
+        </w:rPr>
+        <w:instrText>HYPERLINK "https://www.python.org/" \t "_new"</w:instrText>
+      </w:r>
+      <w:r>
+        <w:fldChar w:fldCharType="separate"/>
+      </w:r>
+      <w:r>
+        <w:rPr>
+          <w:rStyle w:val="Hipervnculo"/>
+          <w:rFonts w:ascii="Arial" w:hAnsi="Arial" w:cs="Arial"/>
+          <w:lang w:val="en-US"/>
+        </w:rPr>
+        <w:t>https://www.python.org/</w:t>
+      </w:r>
+      <w:r>
+        <w:rPr>
+          <w:rStyle w:val="Hipervnculo"/>
+          <w:rFonts w:ascii="Arial" w:hAnsi="Arial" w:cs="Arial"/>
+          <w:lang w:val="en-US"/>
+        </w:rPr>
+        <w:fldChar w:fldCharType="end"/>
+      </w:r>
     </w:p>
     <w:p>
       <w:pPr>
@@ -5711,16 +5701,34 @@
         </w:rPr>
         <w:t xml:space="preserve">. </w:t>
       </w:r>
-      <w:hyperlink r:id="rId10" w:tgtFrame="_new" w:history="1">
-        <w:r>
-          <w:rPr>
-            <w:rStyle w:val="Hipervnculo"/>
-            <w:rFonts w:ascii="Arial" w:hAnsi="Arial" w:cs="Arial"/>
-            <w:lang w:val="es-ES"/>
-          </w:rPr>
-          <w:t>https://www.postgresql.org/</w:t>
-        </w:r>
-      </w:hyperlink>
+      <w:r>
+        <w:fldChar w:fldCharType="begin"/>
+      </w:r>
+      <w:r>
+        <w:rPr>
+          <w:lang w:val="en-US"/>
+        </w:rPr>
+        <w:instrText>HYPERLINK "https://www.postgresql.org/" \t "_new"</w:instrText>
+      </w:r>
+      <w:r>
+        <w:fldChar w:fldCharType="separate"/>
+      </w:r>
+      <w:r>
+        <w:rPr>
+          <w:rStyle w:val="Hipervnculo"/>
+          <w:rFonts w:ascii="Arial" w:hAnsi="Arial" w:cs="Arial"/>
+          <w:lang w:val="es-ES"/>
+        </w:rPr>
+        <w:t>https://www.postgresql.org/</w:t>
+      </w:r>
+      <w:r>
+        <w:rPr>
+          <w:rStyle w:val="Hipervnculo"/>
+          <w:rFonts w:ascii="Arial" w:hAnsi="Arial" w:cs="Arial"/>
+          <w:lang w:val="es-ES"/>
+        </w:rPr>
+        <w:fldChar w:fldCharType="end"/>
+      </w:r>
     </w:p>
     <w:p>
       <w:pPr>
@@ -5757,16 +5765,34 @@
         </w:rPr>
         <w:t xml:space="preserve">. </w:t>
       </w:r>
-      <w:hyperlink r:id="rId11" w:tgtFrame="_new" w:history="1">
-        <w:r>
-          <w:rPr>
-            <w:rStyle w:val="Hipervnculo"/>
-            <w:rFonts w:ascii="Arial" w:hAnsi="Arial" w:cs="Arial"/>
-            <w:lang w:val="es-ES"/>
-          </w:rPr>
-          <w:t>https://to-do.microsoft.com/</w:t>
-        </w:r>
-      </w:hyperlink>
+      <w:r>
+        <w:fldChar w:fldCharType="begin"/>
+      </w:r>
+      <w:r>
+        <w:rPr>
+          <w:lang w:val="en-US"/>
+        </w:rPr>
+        <w:instrText>HYPERLINK "https://to-do.microsoft.com/" \t "_new"</w:instrText>
+      </w:r>
+      <w:r>
+        <w:fldChar w:fldCharType="separate"/>
+      </w:r>
+      <w:r>
+        <w:rPr>
+          <w:rStyle w:val="Hipervnculo"/>
+          <w:rFonts w:ascii="Arial" w:hAnsi="Arial" w:cs="Arial"/>
+          <w:lang w:val="es-ES"/>
+        </w:rPr>
+        <w:t>https://to-do.microsoft.com/</w:t>
+      </w:r>
+      <w:r>
+        <w:rPr>
+          <w:rStyle w:val="Hipervnculo"/>
+          <w:rFonts w:ascii="Arial" w:hAnsi="Arial" w:cs="Arial"/>
+          <w:lang w:val="es-ES"/>
+        </w:rPr>
+        <w:fldChar w:fldCharType="end"/>
+      </w:r>
     </w:p>
     <w:p>
       <w:pPr>
@@ -6008,6 +6034,7 @@
           <w:szCs w:val="24"/>
           <w:lang w:val="es-CO"/>
         </w:rPr>
+        <w:lastRenderedPageBreak/>
         <w:t>Funciones del Producto</w:t>
       </w:r>
       <w:bookmarkEnd w:id="15"/>
@@ -6647,6 +6674,7 @@
           <w:b/>
           <w:bCs/>
         </w:rPr>
+        <w:lastRenderedPageBreak/>
         <w:t>Funcionalidades colaborativas:</w:t>
       </w:r>
       <w:r>
@@ -7094,6 +7122,7 @@
           <w:szCs w:val="24"/>
           <w:lang w:val="es-ES"/>
         </w:rPr>
+        <w:lastRenderedPageBreak/>
         <w:t>Arq</w:t>
       </w:r>
       <w:r>
@@ -7295,12 +7324,16 @@
     <w:p>
       <w:pPr>
         <w:pStyle w:val="Ttulo2"/>
+        <w:rPr>
+          <w:lang w:val="es-ES"/>
+        </w:rPr>
       </w:pPr>
       <w:bookmarkStart w:id="23" w:name="_Toc177775609"/>
       <w:r>
         <w:rPr>
           <w:rFonts w:cs="Arial"/>
           <w:szCs w:val="24"/>
+          <w:lang w:val="es-ES"/>
         </w:rPr>
         <w:t>3.3.</w:t>
       </w:r>
@@ -7308,6 +7341,7 @@
         <w:rPr>
           <w:rFonts w:cs="Arial"/>
           <w:szCs w:val="24"/>
+          <w:lang w:val="es-ES"/>
         </w:rPr>
         <w:t xml:space="preserve">      </w:t>
       </w:r>
@@ -7315,10 +7349,14 @@
         <w:rPr>
           <w:rFonts w:cs="Arial"/>
           <w:szCs w:val="24"/>
+          <w:lang w:val="es-ES"/>
         </w:rPr>
         <w:t>Tecnología Python y PostgreSQL</w:t>
       </w:r>
       <w:r>
+        <w:rPr>
+          <w:lang w:val="es-ES"/>
+        </w:rPr>
         <w:t>:</w:t>
       </w:r>
       <w:bookmarkEnd w:id="23"/>
@@ -7391,6 +7429,7 @@
         <w:rPr>
           <w:rFonts w:cs="Arial"/>
           <w:szCs w:val="24"/>
+          <w:lang w:val="es-ES"/>
         </w:rPr>
       </w:pPr>
       <w:bookmarkStart w:id="24" w:name="_Toc177775610"/>
@@ -7398,6 +7437,7 @@
         <w:rPr>
           <w:rFonts w:cs="Arial"/>
           <w:szCs w:val="24"/>
+          <w:lang w:val="es-ES"/>
         </w:rPr>
         <w:t xml:space="preserve">3.4. </w:t>
       </w:r>
@@ -7405,6 +7445,7 @@
         <w:rPr>
           <w:rFonts w:cs="Arial"/>
           <w:szCs w:val="24"/>
+          <w:lang w:val="es-ES"/>
         </w:rPr>
         <w:t xml:space="preserve">     </w:t>
       </w:r>
@@ -7412,6 +7453,7 @@
         <w:rPr>
           <w:rFonts w:cs="Arial"/>
           <w:szCs w:val="24"/>
+          <w:lang w:val="es-ES"/>
         </w:rPr>
         <w:t>Sistema Local y Offline:</w:t>
       </w:r>
@@ -7510,13 +7552,7 @@
         <w:rPr>
           <w:lang w:val="es-ES"/>
         </w:rPr>
-        <w:t>Entrevistas</w:t>
-      </w:r>
-      <w:r>
-        <w:rPr>
-          <w:lang w:val="es-ES"/>
-        </w:rPr>
-        <w:t xml:space="preserve"> con los usuarios</w:t>
+        <w:t>Entrevistas con los usuarios</w:t>
       </w:r>
       <w:bookmarkEnd w:id="26"/>
     </w:p>
@@ -7575,6 +7611,7 @@
           <w:bCs/>
           <w:lang w:val="es-ES"/>
         </w:rPr>
+        <w:lastRenderedPageBreak/>
         <w:t>Formato de Entrevista:</w:t>
       </w:r>
     </w:p>
@@ -7991,6 +8028,7 @@
         <w:rPr>
           <w:lang w:val="es-CO"/>
         </w:rPr>
+        <w:lastRenderedPageBreak/>
         <w:t>Requisitos Específicos</w:t>
       </w:r>
       <w:bookmarkEnd w:id="28"/>
@@ -10182,7 +10220,6 @@
               <w:rPr>
                 <w:rFonts w:ascii="Arial" w:hAnsi="Arial" w:cs="Arial"/>
               </w:rPr>
-              <w:lastRenderedPageBreak/>
               <w:t>Fuente del requisito</w:t>
             </w:r>
           </w:p>
@@ -10358,6 +10395,7 @@
               <w:rPr>
                 <w:rFonts w:ascii="Arial" w:hAnsi="Arial" w:cs="Arial"/>
               </w:rPr>
+              <w:lastRenderedPageBreak/>
               <w:t>Número de requisito</w:t>
             </w:r>
           </w:p>
@@ -12147,7 +12185,6 @@
           <w:bCs/>
           <w:lang w:val="es-ES"/>
         </w:rPr>
-        <w:lastRenderedPageBreak/>
         <w:t>Encabezado:</w:t>
       </w:r>
     </w:p>
@@ -12199,6 +12236,7 @@
           <w:rFonts w:ascii="Arial" w:hAnsi="Arial" w:cs="Arial"/>
           <w:lang w:val="es-ES"/>
         </w:rPr>
+        <w:lastRenderedPageBreak/>
         <w:t>Iconos de navegación: a la izquierda, un icono de "Inicio" que permite al usuario regresar al menú principal.</w:t>
       </w:r>
     </w:p>
@@ -12733,7 +12771,6 @@
           <w:szCs w:val="24"/>
           <w:lang w:val="es-CO"/>
         </w:rPr>
-        <w:lastRenderedPageBreak/>
         <w:t>Interfaz de Hardware</w:t>
       </w:r>
       <w:bookmarkEnd w:id="31"/>
@@ -13344,7 +13381,6 @@
           <w:bCs/>
           <w:lang w:val="es-ES"/>
         </w:rPr>
-        <w:lastRenderedPageBreak/>
         <w:t>Descripción del producto software utilizado</w:t>
       </w:r>
       <w:r>
@@ -13883,7 +13919,6 @@
           <w:szCs w:val="24"/>
           <w:lang w:val="es-CO"/>
         </w:rPr>
-        <w:lastRenderedPageBreak/>
         <w:t>Requisitos Funcionales</w:t>
       </w:r>
       <w:bookmarkEnd w:id="34"/>
@@ -13942,6 +13977,7 @@
           <w:bCs/>
           <w:lang w:val="es-ES"/>
         </w:rPr>
+        <w:lastRenderedPageBreak/>
         <w:t>Descripción:</w:t>
       </w:r>
       <w:r>
@@ -14385,7 +14421,6 @@
           <w:rFonts w:ascii="Arial" w:hAnsi="Arial" w:cs="Arial"/>
           <w:lang w:val="es-ES"/>
         </w:rPr>
-        <w:lastRenderedPageBreak/>
         <w:t>Si las credenciales son incorrectas, el sistema debe mostrar un mensaje de error adecuado.</w:t>
       </w:r>
     </w:p>
@@ -14444,6 +14479,7 @@
           <w:rFonts w:ascii="Arial" w:hAnsi="Arial" w:cs="Arial"/>
           <w:lang w:val="es-ES"/>
         </w:rPr>
+        <w:lastRenderedPageBreak/>
         <w:br/>
       </w:r>
       <w:r>
@@ -15059,7 +15095,6 @@
           <w:bCs/>
           <w:lang w:val="es-ES"/>
         </w:rPr>
-        <w:lastRenderedPageBreak/>
         <w:t>RF-005: Eliminar Tarea</w:t>
       </w:r>
     </w:p>
@@ -15137,6 +15172,7 @@
           <w:bCs/>
           <w:lang w:val="es-ES"/>
         </w:rPr>
+        <w:lastRenderedPageBreak/>
         <w:t>Criterios de Aceptación:</w:t>
       </w:r>
     </w:p>
@@ -15855,7 +15891,6 @@
           <w:bCs/>
           <w:lang w:val="es-ES"/>
         </w:rPr>
-        <w:lastRenderedPageBreak/>
         <w:t>RF-008: Etiquetar</w:t>
       </w:r>
       <w:r>
@@ -16801,7 +16836,6 @@
           <w:bCs/>
           <w:lang w:val="es-ES"/>
         </w:rPr>
-        <w:lastRenderedPageBreak/>
         <w:t>RF-0</w:t>
       </w:r>
       <w:r>
@@ -16888,7 +16922,14 @@
         <w:rPr>
           <w:rFonts w:ascii="Arial" w:hAnsi="Arial" w:cs="Arial"/>
         </w:rPr>
-        <w:t>El sistema debe establecer una conexión con una base de datos local (PostgreSQL) para gestionar y almacenar los datos relacionados con los usuarios y sus tareas, permitiendo operaciones como la creación, edición, eliminación y consulta de dicha información.</w:t>
+        <w:t xml:space="preserve">El sistema debe establecer una conexión con una base de datos local (PostgreSQL) para gestionar y almacenar los datos relacionados con los usuarios y </w:t>
+      </w:r>
+      <w:r>
+        <w:rPr>
+          <w:rFonts w:ascii="Arial" w:hAnsi="Arial" w:cs="Arial"/>
+        </w:rPr>
+        <w:lastRenderedPageBreak/>
+        <w:t>sus tareas, permitiendo operaciones como la creación, edición, eliminación y consulta de dicha información.</w:t>
       </w:r>
     </w:p>
     <w:p>
@@ -17285,21 +17326,7 @@
         <w:rPr>
           <w:rFonts w:ascii="Arial" w:hAnsi="Arial" w:cs="Arial"/>
         </w:rPr>
-        <w:t xml:space="preserve"> y </w:t>
-      </w:r>
-      <w:proofErr w:type="spellStart"/>
-      <w:r>
-        <w:rPr>
-          <w:rFonts w:ascii="Arial" w:hAnsi="Arial" w:cs="Arial"/>
-        </w:rPr>
-        <w:t>recordario</w:t>
-      </w:r>
-      <w:proofErr w:type="spellEnd"/>
-      <w:r>
-        <w:rPr>
-          <w:rFonts w:ascii="Arial" w:hAnsi="Arial" w:cs="Arial"/>
-        </w:rPr>
-        <w:t>.</w:t>
+        <w:t xml:space="preserve"> y recordario.</w:t>
       </w:r>
     </w:p>
     <w:p>
@@ -17493,7 +17520,6 @@
           <w:rFonts w:ascii="Arial" w:hAnsi="Arial" w:cs="Arial"/>
           <w:lang w:val="es-ES"/>
         </w:rPr>
-        <w:lastRenderedPageBreak/>
         <w:br/>
       </w:r>
       <w:r>
@@ -18216,7 +18242,6 @@
           <w:rFonts w:ascii="Arial" w:hAnsi="Arial" w:cs="Arial"/>
           <w:lang w:val="es-ES"/>
         </w:rPr>
-        <w:lastRenderedPageBreak/>
         <w:t xml:space="preserve">El sistema debe ser capaz de procesar hasta </w:t>
       </w:r>
       <w:r>
@@ -18267,6 +18292,7 @@
           <w:bCs/>
           <w:lang w:val="es-ES"/>
         </w:rPr>
+        <w:lastRenderedPageBreak/>
         <w:t>Velocidad de respuesta:</w:t>
       </w:r>
     </w:p>
@@ -18800,7 +18826,6 @@
           <w:rFonts w:ascii="Arial" w:hAnsi="Arial" w:cs="Arial"/>
           <w:lang w:val="es-ES"/>
         </w:rPr>
-        <w:lastRenderedPageBreak/>
         <w:t>Los iconos y elementos visuales deben ser fácilmente reconocibles y cumplir con las normas estándar de usabilidad (como un ícono de lápiz para editar y un ícono de papelera para eliminar).</w:t>
       </w:r>
     </w:p>
@@ -18836,6 +18861,7 @@
           <w:bCs/>
           <w:lang w:val="es-ES"/>
         </w:rPr>
+        <w:lastRenderedPageBreak/>
         <w:t>Accesibilidad:</w:t>
       </w:r>
     </w:p>
@@ -19292,7 +19318,6 @@
           <w:rFonts w:ascii="Arial" w:hAnsi="Arial" w:cs="Arial"/>
           <w:lang w:val="es-ES"/>
         </w:rPr>
-        <w:lastRenderedPageBreak/>
         <w:t>Se deben realizar respaldos automáticos para evitar la pérdida de información en caso de fallos técnicos o accidentes.</w:t>
       </w:r>
     </w:p>
@@ -19360,6 +19385,7 @@
           <w:rFonts w:ascii="Arial" w:hAnsi="Arial" w:cs="Arial"/>
           <w:lang w:val="es-ES"/>
         </w:rPr>
+        <w:lastRenderedPageBreak/>
         <w:t>Antes de realizar operaciones críticas, como la eliminación o modificación de tareas, el sistema debe realizar comprobaciones básicas para asegurar que los datos no hayan sido corrompidos o modificados accidentalmente.</w:t>
       </w:r>
     </w:p>
@@ -19856,7 +19882,6 @@
           <w:rFonts w:ascii="Arial" w:hAnsi="Arial" w:cs="Arial"/>
           <w:lang w:val="es-ES"/>
         </w:rPr>
-        <w:lastRenderedPageBreak/>
         <w:t>El sistema debe estar documentado para que cualquier desarrollador futuro pueda comprender y realizar modificaciones sin dificultades, reduciendo el tiempo de aprendizaje a menos de 5 horas.</w:t>
       </w:r>
     </w:p>
@@ -19921,6 +19946,7 @@
           <w:rFonts w:ascii="Arial" w:hAnsi="Arial" w:cs="Arial"/>
           <w:lang w:val="es-ES"/>
         </w:rPr>
+        <w:lastRenderedPageBreak/>
         <w:t>El sistema debe ser ejecutable en cualquier computadora con sistema operativo Windows, sin requerir configuraciones especiales.</w:t>
       </w:r>
     </w:p>
@@ -20298,7 +20324,7 @@
         </w:rPr>
         <w:lastRenderedPageBreak/>
         <w:drawing>
-          <wp:inline distT="0" distB="0" distL="0" distR="0" wp14:anchorId="13C5537D" wp14:editId="0279E4E3">
+          <wp:inline distT="0" distB="0" distL="0" distR="0" wp14:anchorId="13C5537D" wp14:editId="68656D2D">
             <wp:extent cx="4958862" cy="3221573"/>
             <wp:effectExtent l="0" t="0" r="0" b="0"/>
             <wp:docPr id="1146101715" name="Imagen 1"/>
@@ -20315,7 +20341,7 @@
                     </pic:cNvPicPr>
                   </pic:nvPicPr>
                   <pic:blipFill>
-                    <a:blip r:embed="rId12" cstate="print">
+                    <a:blip r:embed="rId9" cstate="print">
                       <a:extLst>
                         <a:ext uri="{28A0092B-C50C-407E-A947-70E740481C1C}">
                           <a14:useLocalDpi xmlns:a14="http://schemas.microsoft.com/office/drawing/2010/main" val="0"/>
@@ -20363,19 +20389,40 @@
           <w:lang w:val="en-US"/>
         </w:rPr>
       </w:pPr>
-      <w:hyperlink r:id="rId13" w:history="1">
-        <w:r>
-          <w:rPr>
-            <w:rStyle w:val="Hipervnculo"/>
-            <w:b w:val="0"/>
-            <w:bCs w:val="0"/>
-            <w:sz w:val="18"/>
-            <w:szCs w:val="18"/>
-            <w:lang w:val="en-US"/>
-          </w:rPr>
-          <w:t>https://drive.google.com/file/d/1MVLLpVTGaWERCn8xHRBqrsY-N7o8ijXs/view?usp=sharing</w:t>
-        </w:r>
-      </w:hyperlink>
+      <w:r>
+        <w:fldChar w:fldCharType="begin"/>
+      </w:r>
+      <w:r>
+        <w:rPr>
+          <w:lang w:val="en-US"/>
+        </w:rPr>
+        <w:instrText>HYPERLINK "https://drive.google.com/file/d/1MVLLpVTGaWERCn8xHRBqrsY-N7o8ijXs/view?usp=sharing"</w:instrText>
+      </w:r>
+      <w:r>
+        <w:fldChar w:fldCharType="separate"/>
+      </w:r>
+      <w:r>
+        <w:rPr>
+          <w:rStyle w:val="Hipervnculo"/>
+          <w:b w:val="0"/>
+          <w:bCs w:val="0"/>
+          <w:sz w:val="18"/>
+          <w:szCs w:val="18"/>
+          <w:lang w:val="en-US"/>
+        </w:rPr>
+        <w:t>https://drive.google.com/file/d/1MVLLpVTGaWERCn8xHRBqrsY-N7o8ijXs/view?usp=sharing</w:t>
+      </w:r>
+      <w:r>
+        <w:rPr>
+          <w:rStyle w:val="Hipervnculo"/>
+          <w:b w:val="0"/>
+          <w:bCs w:val="0"/>
+          <w:sz w:val="18"/>
+          <w:szCs w:val="18"/>
+          <w:lang w:val="en-US"/>
+        </w:rPr>
+        <w:fldChar w:fldCharType="end"/>
+      </w:r>
     </w:p>
     <w:p>
       <w:pPr>
@@ -20440,7 +20487,7 @@
                     </pic:cNvPicPr>
                   </pic:nvPicPr>
                   <pic:blipFill>
-                    <a:blip r:embed="rId14">
+                    <a:blip r:embed="rId10">
                       <a:extLst>
                         <a:ext uri="{28A0092B-C50C-407E-A947-70E740481C1C}">
                           <a14:useLocalDpi xmlns:a14="http://schemas.microsoft.com/office/drawing/2010/main" val="0"/>
@@ -20482,18 +20529,38 @@
           <w:lang w:val="en-US"/>
         </w:rPr>
       </w:pPr>
-      <w:hyperlink r:id="rId15" w:history="1">
-        <w:r>
-          <w:rPr>
-            <w:rStyle w:val="Hipervnculo"/>
-            <w:rFonts w:ascii="Arial" w:hAnsi="Arial" w:cs="Arial"/>
-            <w:sz w:val="18"/>
-            <w:szCs w:val="18"/>
-            <w:lang w:val="en-US"/>
-          </w:rPr>
-          <w:t>https://drive.google.com/file/d/1CQ-xOLupclXAeVYfVv1Rm7-QziUXyfIh/view?usp=sharing</w:t>
-        </w:r>
-      </w:hyperlink>
+      <w:r>
+        <w:fldChar w:fldCharType="begin"/>
+      </w:r>
+      <w:r>
+        <w:rPr>
+          <w:lang w:val="en-US"/>
+        </w:rPr>
+        <w:instrText>HYPERLINK "https://drive.google.com/file/d/1CQ-xOLupclXAeVYfVv1Rm7-QziUXyfIh/view?usp=sharing"</w:instrText>
+      </w:r>
+      <w:r>
+        <w:fldChar w:fldCharType="separate"/>
+      </w:r>
+      <w:r>
+        <w:rPr>
+          <w:rStyle w:val="Hipervnculo"/>
+          <w:rFonts w:ascii="Arial" w:hAnsi="Arial" w:cs="Arial"/>
+          <w:sz w:val="18"/>
+          <w:szCs w:val="18"/>
+          <w:lang w:val="en-US"/>
+        </w:rPr>
+        <w:t>https://drive.google.com/file/d/1CQ-xOLupclXAeVYfVv1Rm7-QziUXyfIh/view?usp=sharing</w:t>
+      </w:r>
+      <w:r>
+        <w:rPr>
+          <w:rStyle w:val="Hipervnculo"/>
+          <w:rFonts w:ascii="Arial" w:hAnsi="Arial" w:cs="Arial"/>
+          <w:sz w:val="18"/>
+          <w:szCs w:val="18"/>
+          <w:lang w:val="en-US"/>
+        </w:rPr>
+        <w:fldChar w:fldCharType="end"/>
+      </w:r>
     </w:p>
     <w:p>
       <w:pPr>
@@ -20553,7 +20620,7 @@
                     </pic:cNvPicPr>
                   </pic:nvPicPr>
                   <pic:blipFill>
-                    <a:blip r:embed="rId16">
+                    <a:blip r:embed="rId11">
                       <a:extLst>
                         <a:ext uri="{28A0092B-C50C-407E-A947-70E740481C1C}">
                           <a14:useLocalDpi xmlns:a14="http://schemas.microsoft.com/office/drawing/2010/main" val="0"/>
@@ -20594,18 +20661,38 @@
           <w:lang w:val="en-US"/>
         </w:rPr>
       </w:pPr>
-      <w:hyperlink r:id="rId17" w:history="1">
-        <w:r>
-          <w:rPr>
-            <w:rStyle w:val="Hipervnculo"/>
-            <w:rFonts w:ascii="Arial" w:hAnsi="Arial" w:cs="Arial"/>
-            <w:sz w:val="18"/>
-            <w:szCs w:val="18"/>
-            <w:lang w:val="en-US"/>
-          </w:rPr>
-          <w:t>https://drive.google.com/file/d/1dpS6g-Eb14g3GradsoKtZyCAFFcpq9JD/view?usp=sharing</w:t>
-        </w:r>
-      </w:hyperlink>
+      <w:r>
+        <w:fldChar w:fldCharType="begin"/>
+      </w:r>
+      <w:r>
+        <w:rPr>
+          <w:lang w:val="en-US"/>
+        </w:rPr>
+        <w:instrText>HYPERLINK "https://drive.google.com/file/d/1dpS6g-Eb14g3GradsoKtZyCAFFcpq9JD/view?usp=sharing"</w:instrText>
+      </w:r>
+      <w:r>
+        <w:fldChar w:fldCharType="separate"/>
+      </w:r>
+      <w:r>
+        <w:rPr>
+          <w:rStyle w:val="Hipervnculo"/>
+          <w:rFonts w:ascii="Arial" w:hAnsi="Arial" w:cs="Arial"/>
+          <w:sz w:val="18"/>
+          <w:szCs w:val="18"/>
+          <w:lang w:val="en-US"/>
+        </w:rPr>
+        <w:t>https://drive.google.com/file/d/1dpS6g-Eb14g3GradsoKtZyCAFFcpq9JD/view?usp=sharing</w:t>
+      </w:r>
+      <w:r>
+        <w:rPr>
+          <w:rStyle w:val="Hipervnculo"/>
+          <w:rFonts w:ascii="Arial" w:hAnsi="Arial" w:cs="Arial"/>
+          <w:sz w:val="18"/>
+          <w:szCs w:val="18"/>
+          <w:lang w:val="en-US"/>
+        </w:rPr>
+        <w:fldChar w:fldCharType="end"/>
+      </w:r>
     </w:p>
     <w:p>
       <w:pPr>
@@ -20671,7 +20758,7 @@
                     </pic:cNvPicPr>
                   </pic:nvPicPr>
                   <pic:blipFill>
-                    <a:blip r:embed="rId18" cstate="print">
+                    <a:blip r:embed="rId12" cstate="print">
                       <a:extLst>
                         <a:ext uri="{28A0092B-C50C-407E-A947-70E740481C1C}">
                           <a14:useLocalDpi xmlns:a14="http://schemas.microsoft.com/office/drawing/2010/main" val="0"/>
@@ -20707,7 +20794,7 @@
       <w:pPr>
         <w:pStyle w:val="Descripcin"/>
       </w:pPr>
-      <w:hyperlink r:id="rId19" w:history="1">
+      <w:hyperlink r:id="rId13" w:history="1">
         <w:r>
           <w:rPr>
             <w:rStyle w:val="Hipervnculo"/>
@@ -20773,7 +20860,7 @@
                     </pic:cNvPicPr>
                   </pic:nvPicPr>
                   <pic:blipFill>
-                    <a:blip r:embed="rId20" cstate="print">
+                    <a:blip r:embed="rId14" cstate="print">
                       <a:extLst>
                         <a:ext uri="{28A0092B-C50C-407E-A947-70E740481C1C}">
                           <a14:useLocalDpi xmlns:a14="http://schemas.microsoft.com/office/drawing/2010/main" val="0"/>
@@ -20812,7 +20899,7 @@
           <w:noProof/>
         </w:rPr>
       </w:pPr>
-      <w:hyperlink r:id="rId21" w:history="1">
+      <w:hyperlink r:id="rId15" w:history="1">
         <w:r>
           <w:rPr>
             <w:rStyle w:val="Hipervnculo"/>
@@ -20883,7 +20970,7 @@
                     </pic:cNvPicPr>
                   </pic:nvPicPr>
                   <pic:blipFill>
-                    <a:blip r:embed="rId22" cstate="print">
+                    <a:blip r:embed="rId16" cstate="print">
                       <a:extLst>
                         <a:ext uri="{28A0092B-C50C-407E-A947-70E740481C1C}">
                           <a14:useLocalDpi xmlns:a14="http://schemas.microsoft.com/office/drawing/2010/main" val="0"/>
@@ -20919,7 +21006,7 @@
       <w:pPr>
         <w:pStyle w:val="Descripcin"/>
       </w:pPr>
-      <w:hyperlink r:id="rId23" w:history="1">
+      <w:hyperlink r:id="rId17" w:history="1">
         <w:r>
           <w:rPr>
             <w:rStyle w:val="Hipervnculo"/>
@@ -20985,7 +21072,7 @@
                     </pic:cNvPicPr>
                   </pic:nvPicPr>
                   <pic:blipFill>
-                    <a:blip r:embed="rId24">
+                    <a:blip r:embed="rId18">
                       <a:extLst>
                         <a:ext uri="{28A0092B-C50C-407E-A947-70E740481C1C}">
                           <a14:useLocalDpi xmlns:a14="http://schemas.microsoft.com/office/drawing/2010/main" val="0"/>
@@ -21021,7 +21108,7 @@
       <w:pPr>
         <w:pStyle w:val="Descripcin"/>
       </w:pPr>
-      <w:hyperlink r:id="rId25" w:history="1">
+      <w:hyperlink r:id="rId19" w:history="1">
         <w:r>
           <w:rPr>
             <w:rStyle w:val="Hipervnculo"/>
@@ -21087,7 +21174,7 @@
                     </pic:cNvPicPr>
                   </pic:nvPicPr>
                   <pic:blipFill>
-                    <a:blip r:embed="rId26">
+                    <a:blip r:embed="rId20">
                       <a:extLst>
                         <a:ext uri="{28A0092B-C50C-407E-A947-70E740481C1C}">
                           <a14:useLocalDpi xmlns:a14="http://schemas.microsoft.com/office/drawing/2010/main" val="0"/>
@@ -21123,7 +21210,7 @@
       <w:pPr>
         <w:pStyle w:val="Descripcin"/>
       </w:pPr>
-      <w:hyperlink r:id="rId27" w:history="1">
+      <w:hyperlink r:id="rId21" w:history="1">
         <w:r>
           <w:rPr>
             <w:rStyle w:val="Hipervnculo"/>
@@ -21190,7 +21277,7 @@
                     </pic:cNvPicPr>
                   </pic:nvPicPr>
                   <pic:blipFill>
-                    <a:blip r:embed="rId28">
+                    <a:blip r:embed="rId22">
                       <a:extLst>
                         <a:ext uri="{28A0092B-C50C-407E-A947-70E740481C1C}">
                           <a14:useLocalDpi xmlns:a14="http://schemas.microsoft.com/office/drawing/2010/main" val="0"/>
@@ -21226,7 +21313,7 @@
       <w:pPr>
         <w:pStyle w:val="Descripcin"/>
       </w:pPr>
-      <w:hyperlink r:id="rId29" w:history="1">
+      <w:hyperlink r:id="rId23" w:history="1">
         <w:r>
           <w:rPr>
             <w:rStyle w:val="Hipervnculo"/>
@@ -21298,7 +21385,7 @@
                     </pic:cNvPicPr>
                   </pic:nvPicPr>
                   <pic:blipFill>
-                    <a:blip r:embed="rId30">
+                    <a:blip r:embed="rId24">
                       <a:extLst>
                         <a:ext uri="{28A0092B-C50C-407E-A947-70E740481C1C}">
                           <a14:useLocalDpi xmlns:a14="http://schemas.microsoft.com/office/drawing/2010/main" val="0"/>
@@ -21334,7 +21421,7 @@
       <w:pPr>
         <w:pStyle w:val="Descripcin"/>
       </w:pPr>
-      <w:hyperlink r:id="rId31" w:history="1">
+      <w:hyperlink r:id="rId25" w:history="1">
         <w:r>
           <w:rPr>
             <w:rStyle w:val="Hipervnculo"/>
@@ -21405,7 +21492,7 @@
                     </pic:cNvPicPr>
                   </pic:nvPicPr>
                   <pic:blipFill>
-                    <a:blip r:embed="rId32">
+                    <a:blip r:embed="rId26">
                       <a:extLst>
                         <a:ext uri="{28A0092B-C50C-407E-A947-70E740481C1C}">
                           <a14:useLocalDpi xmlns:a14="http://schemas.microsoft.com/office/drawing/2010/main" val="0"/>
@@ -21444,7 +21531,7 @@
           <w:lang w:val="es-ES"/>
         </w:rPr>
       </w:pPr>
-      <w:hyperlink r:id="rId33" w:history="1">
+      <w:hyperlink r:id="rId27" w:history="1">
         <w:r>
           <w:rPr>
             <w:rStyle w:val="Hipervnculo"/>
@@ -21523,6 +21610,7 @@
       </w:pPr>
       <w:r>
         <w:rPr>
+          <w:noProof/>
           <w:lang w:val="en-US"/>
         </w:rPr>
         <w:lastRenderedPageBreak/>
@@ -21542,7 +21630,7 @@
                     <pic:cNvPicPr/>
                   </pic:nvPicPr>
                   <pic:blipFill>
-                    <a:blip r:embed="rId34"/>
+                    <a:blip r:embed="rId28"/>
                     <a:stretch>
                       <a:fillRect/>
                     </a:stretch>
@@ -21570,7 +21658,7 @@
           <w:lang w:val="en-US"/>
         </w:rPr>
       </w:pPr>
-      <w:hyperlink r:id="rId35" w:history="1">
+      <w:hyperlink r:id="rId29" w:history="1">
         <w:r>
           <w:rPr>
             <w:rStyle w:val="Hipervnculo"/>
@@ -21641,7 +21729,7 @@
                     </pic:cNvPicPr>
                   </pic:nvPicPr>
                   <pic:blipFill>
-                    <a:blip r:embed="rId36">
+                    <a:blip r:embed="rId30">
                       <a:extLst>
                         <a:ext uri="{28A0092B-C50C-407E-A947-70E740481C1C}">
                           <a14:useLocalDpi xmlns:a14="http://schemas.microsoft.com/office/drawing/2010/main" val="0"/>
@@ -21677,7 +21765,7 @@
       <w:pPr>
         <w:pStyle w:val="Descripcin"/>
       </w:pPr>
-      <w:hyperlink r:id="rId37" w:history="1">
+      <w:hyperlink r:id="rId31" w:history="1">
         <w:r>
           <w:rPr>
             <w:rStyle w:val="Hipervnculo"/>
@@ -21748,7 +21836,7 @@
                     </pic:cNvPicPr>
                   </pic:nvPicPr>
                   <pic:blipFill>
-                    <a:blip r:embed="rId38">
+                    <a:blip r:embed="rId32">
                       <a:extLst>
                         <a:ext uri="{28A0092B-C50C-407E-A947-70E740481C1C}">
                           <a14:useLocalDpi xmlns:a14="http://schemas.microsoft.com/office/drawing/2010/main" val="0"/>
@@ -21784,7 +21872,7 @@
       <w:pPr>
         <w:pStyle w:val="Descripcin"/>
       </w:pPr>
-      <w:hyperlink r:id="rId39" w:history="1">
+      <w:hyperlink r:id="rId33" w:history="1">
         <w:r>
           <w:rPr>
             <w:rStyle w:val="Hipervnculo"/>
@@ -21856,7 +21944,7 @@
                     </pic:cNvPicPr>
                   </pic:nvPicPr>
                   <pic:blipFill>
-                    <a:blip r:embed="rId40">
+                    <a:blip r:embed="rId34">
                       <a:extLst>
                         <a:ext uri="{28A0092B-C50C-407E-A947-70E740481C1C}">
                           <a14:useLocalDpi xmlns:a14="http://schemas.microsoft.com/office/drawing/2010/main" val="0"/>
@@ -21895,7 +21983,7 @@
           <w:lang w:val="es-ES"/>
         </w:rPr>
       </w:pPr>
-      <w:hyperlink r:id="rId41" w:history="1">
+      <w:hyperlink r:id="rId35" w:history="1">
         <w:r>
           <w:rPr>
             <w:rStyle w:val="Hipervnculo"/>
@@ -21946,6 +22034,7 @@
       </w:pPr>
       <w:r>
         <w:rPr>
+          <w:noProof/>
           <w:lang w:val="es-ES"/>
         </w:rPr>
         <w:drawing>
@@ -21964,7 +22053,7 @@
                     <pic:cNvPicPr/>
                   </pic:nvPicPr>
                   <pic:blipFill>
-                    <a:blip r:embed="rId42"/>
+                    <a:blip r:embed="rId36"/>
                     <a:stretch>
                       <a:fillRect/>
                     </a:stretch>
@@ -21992,7 +22081,7 @@
           <w:lang w:val="es-ES"/>
         </w:rPr>
       </w:pPr>
-      <w:hyperlink r:id="rId43" w:history="1">
+      <w:hyperlink r:id="rId37" w:history="1">
         <w:r>
           <w:rPr>
             <w:rStyle w:val="Hipervnculo"/>
@@ -22055,6 +22144,7 @@
       </w:pPr>
       <w:r>
         <w:rPr>
+          <w:noProof/>
           <w:lang w:val="es-ES"/>
         </w:rPr>
         <w:drawing>
@@ -22073,7 +22163,7 @@
                     <pic:cNvPicPr/>
                   </pic:nvPicPr>
                   <pic:blipFill>
-                    <a:blip r:embed="rId44"/>
+                    <a:blip r:embed="rId38"/>
                     <a:stretch>
                       <a:fillRect/>
                     </a:stretch>
@@ -22101,7 +22191,7 @@
           <w:lang w:val="es-ES"/>
         </w:rPr>
       </w:pPr>
-      <w:hyperlink r:id="rId45" w:history="1">
+      <w:hyperlink r:id="rId39" w:history="1">
         <w:r>
           <w:rPr>
             <w:rStyle w:val="Hipervnculo"/>
@@ -22173,7 +22263,7 @@
                     </pic:cNvPicPr>
                   </pic:nvPicPr>
                   <pic:blipFill>
-                    <a:blip r:embed="rId46">
+                    <a:blip r:embed="rId40">
                       <a:extLst>
                         <a:ext uri="{28A0092B-C50C-407E-A947-70E740481C1C}">
                           <a14:useLocalDpi xmlns:a14="http://schemas.microsoft.com/office/drawing/2010/main" val="0"/>
@@ -22212,7 +22302,7 @@
           <w:lang w:val="es-ES"/>
         </w:rPr>
       </w:pPr>
-      <w:hyperlink r:id="rId47" w:history="1">
+      <w:hyperlink r:id="rId41" w:history="1">
         <w:r>
           <w:rPr>
             <w:rStyle w:val="Hipervnculo"/>
@@ -22263,6 +22353,7 @@
       </w:pPr>
       <w:r>
         <w:rPr>
+          <w:noProof/>
           <w:lang w:val="es-ES"/>
         </w:rPr>
         <w:drawing>
@@ -22281,7 +22372,7 @@
                     <pic:cNvPicPr/>
                   </pic:nvPicPr>
                   <pic:blipFill>
-                    <a:blip r:embed="rId48"/>
+                    <a:blip r:embed="rId42"/>
                     <a:stretch>
                       <a:fillRect/>
                     </a:stretch>
@@ -22309,7 +22400,7 @@
           <w:lang w:val="es-ES"/>
         </w:rPr>
       </w:pPr>
-      <w:hyperlink r:id="rId49" w:history="1">
+      <w:hyperlink r:id="rId43" w:history="1">
         <w:r>
           <w:rPr>
             <w:rStyle w:val="Hipervnculo"/>
@@ -22380,7 +22471,7 @@
                     </pic:cNvPicPr>
                   </pic:nvPicPr>
                   <pic:blipFill>
-                    <a:blip r:embed="rId50">
+                    <a:blip r:embed="rId44">
                       <a:extLst>
                         <a:ext uri="{28A0092B-C50C-407E-A947-70E740481C1C}">
                           <a14:useLocalDpi xmlns:a14="http://schemas.microsoft.com/office/drawing/2010/main" val="0"/>
@@ -22416,7 +22507,7 @@
       <w:pPr>
         <w:pStyle w:val="Descripcin"/>
       </w:pPr>
-      <w:hyperlink r:id="rId51" w:history="1">
+      <w:hyperlink r:id="rId45" w:history="1">
         <w:r>
           <w:rPr>
             <w:rStyle w:val="Hipervnculo"/>
@@ -22488,7 +22579,7 @@
                     </pic:cNvPicPr>
                   </pic:nvPicPr>
                   <pic:blipFill>
-                    <a:blip r:embed="rId52">
+                    <a:blip r:embed="rId46">
                       <a:extLst>
                         <a:ext uri="{28A0092B-C50C-407E-A947-70E740481C1C}">
                           <a14:useLocalDpi xmlns:a14="http://schemas.microsoft.com/office/drawing/2010/main" val="0"/>
@@ -22524,7 +22615,7 @@
       <w:pPr>
         <w:pStyle w:val="Descripcin"/>
       </w:pPr>
-      <w:hyperlink r:id="rId53" w:history="1">
+      <w:hyperlink r:id="rId47" w:history="1">
         <w:r>
           <w:rPr>
             <w:rStyle w:val="Hipervnculo"/>
@@ -22595,7 +22686,7 @@
                     </pic:cNvPicPr>
                   </pic:nvPicPr>
                   <pic:blipFill>
-                    <a:blip r:embed="rId54">
+                    <a:blip r:embed="rId48">
                       <a:extLst>
                         <a:ext uri="{28A0092B-C50C-407E-A947-70E740481C1C}">
                           <a14:useLocalDpi xmlns:a14="http://schemas.microsoft.com/office/drawing/2010/main" val="0"/>
@@ -22631,7 +22722,7 @@
       <w:pPr>
         <w:pStyle w:val="Descripcin"/>
       </w:pPr>
-      <w:hyperlink r:id="rId55" w:history="1">
+      <w:hyperlink r:id="rId49" w:history="1">
         <w:r>
           <w:rPr>
             <w:rStyle w:val="Hipervnculo"/>
@@ -22702,7 +22793,7 @@
                     </pic:cNvPicPr>
                   </pic:nvPicPr>
                   <pic:blipFill>
-                    <a:blip r:embed="rId56">
+                    <a:blip r:embed="rId50">
                       <a:extLst>
                         <a:ext uri="{28A0092B-C50C-407E-A947-70E740481C1C}">
                           <a14:useLocalDpi xmlns:a14="http://schemas.microsoft.com/office/drawing/2010/main" val="0"/>
@@ -22738,7 +22829,7 @@
       <w:pPr>
         <w:pStyle w:val="Descripcin"/>
       </w:pPr>
-      <w:hyperlink r:id="rId57" w:history="1">
+      <w:hyperlink r:id="rId51" w:history="1">
         <w:r>
           <w:rPr>
             <w:rStyle w:val="Hipervnculo"/>
@@ -22810,7 +22901,7 @@
                     </pic:cNvPicPr>
                   </pic:nvPicPr>
                   <pic:blipFill>
-                    <a:blip r:embed="rId58">
+                    <a:blip r:embed="rId52">
                       <a:extLst>
                         <a:ext uri="{28A0092B-C50C-407E-A947-70E740481C1C}">
                           <a14:useLocalDpi xmlns:a14="http://schemas.microsoft.com/office/drawing/2010/main" val="0"/>
@@ -22846,7 +22937,7 @@
       <w:pPr>
         <w:pStyle w:val="Descripcin"/>
       </w:pPr>
-      <w:hyperlink r:id="rId59" w:history="1">
+      <w:hyperlink r:id="rId53" w:history="1">
         <w:r>
           <w:rPr>
             <w:rStyle w:val="Hipervnculo"/>
@@ -22895,16 +22986,22 @@
     <w:p>
       <w:pPr>
         <w:pStyle w:val="Ttulo1"/>
+        <w:rPr>
+          <w:lang w:val="es-ES"/>
+        </w:rPr>
       </w:pPr>
       <w:bookmarkStart w:id="45" w:name="_Toc177775631"/>
       <w:r>
-        <w:t xml:space="preserve">8. </w:t>
-      </w:r>
-      <w:r>
-        <w:t>Historias de usuario</w:t>
+        <w:rPr>
+          <w:lang w:val="es-ES"/>
+        </w:rPr>
+        <w:t>8. Historias de usuario</w:t>
       </w:r>
       <w:bookmarkEnd w:id="45"/>
       <w:r>
+        <w:rPr>
+          <w:lang w:val="es-ES"/>
+        </w:rPr>
         <w:t xml:space="preserve"> </w:t>
       </w:r>
     </w:p>
@@ -23154,7 +23251,7 @@
                           <pic:cNvPicPr/>
                         </pic:nvPicPr>
                         <pic:blipFill rotWithShape="1">
-                          <a:blip r:embed="rId60"/>
+                          <a:blip r:embed="rId54"/>
                           <a:srcRect l="1288" t="1807" r="1273" b="2433"/>
                           <a:stretch/>
                         </pic:blipFill>
@@ -23204,7 +23301,7 @@
                           <pic:cNvPicPr/>
                         </pic:nvPicPr>
                         <pic:blipFill>
-                          <a:blip r:embed="rId61"/>
+                          <a:blip r:embed="rId55"/>
                           <a:stretch>
                             <a:fillRect/>
                           </a:stretch>
@@ -23505,7 +23602,7 @@
                           <pic:cNvPicPr/>
                         </pic:nvPicPr>
                         <pic:blipFill>
-                          <a:blip r:embed="rId62"/>
+                          <a:blip r:embed="rId56"/>
                           <a:stretch>
                             <a:fillRect/>
                           </a:stretch>
@@ -23548,7 +23645,7 @@
                           <pic:cNvPicPr/>
                         </pic:nvPicPr>
                         <pic:blipFill>
-                          <a:blip r:embed="rId63"/>
+                          <a:blip r:embed="rId57"/>
                           <a:stretch>
                             <a:fillRect/>
                           </a:stretch>
@@ -23883,7 +23980,7 @@
                           <pic:cNvPicPr/>
                         </pic:nvPicPr>
                         <pic:blipFill>
-                          <a:blip r:embed="rId64"/>
+                          <a:blip r:embed="rId58"/>
                           <a:stretch>
                             <a:fillRect/>
                           </a:stretch>
@@ -24195,7 +24292,7 @@
                           <pic:cNvPicPr/>
                         </pic:nvPicPr>
                         <pic:blipFill>
-                          <a:blip r:embed="rId65"/>
+                          <a:blip r:embed="rId59"/>
                           <a:stretch>
                             <a:fillRect/>
                           </a:stretch>
@@ -24239,7 +24336,7 @@
                           <pic:cNvPicPr/>
                         </pic:nvPicPr>
                         <pic:blipFill>
-                          <a:blip r:embed="rId66"/>
+                          <a:blip r:embed="rId60"/>
                           <a:stretch>
                             <a:fillRect/>
                           </a:stretch>
@@ -24270,6 +24367,7 @@
           </w:tcPr>
           <w:p>
             <w:r>
+              <w:lastRenderedPageBreak/>
               <w:t>Autor</w:t>
             </w:r>
           </w:p>
@@ -24515,7 +24613,7 @@
                           <pic:cNvPicPr/>
                         </pic:nvPicPr>
                         <pic:blipFill>
-                          <a:blip r:embed="rId67"/>
+                          <a:blip r:embed="rId61"/>
                           <a:stretch>
                             <a:fillRect/>
                           </a:stretch>
@@ -24774,7 +24872,7 @@
                           <pic:cNvPicPr/>
                         </pic:nvPicPr>
                         <pic:blipFill>
-                          <a:blip r:embed="rId68"/>
+                          <a:blip r:embed="rId62"/>
                           <a:stretch>
                             <a:fillRect/>
                           </a:stretch>
@@ -25033,7 +25131,7 @@
                           <pic:cNvPicPr/>
                         </pic:nvPicPr>
                         <pic:blipFill>
-                          <a:blip r:embed="rId69"/>
+                          <a:blip r:embed="rId63"/>
                           <a:stretch>
                             <a:fillRect/>
                           </a:stretch>
@@ -25076,7 +25174,7 @@
                           <pic:cNvPicPr/>
                         </pic:nvPicPr>
                         <pic:blipFill>
-                          <a:blip r:embed="rId70"/>
+                          <a:blip r:embed="rId64"/>
                           <a:stretch>
                             <a:fillRect/>
                           </a:stretch>
@@ -25119,7 +25217,7 @@
                           <pic:cNvPicPr/>
                         </pic:nvPicPr>
                         <pic:blipFill>
-                          <a:blip r:embed="rId71"/>
+                          <a:blip r:embed="rId65"/>
                           <a:stretch>
                             <a:fillRect/>
                           </a:stretch>
@@ -25394,7 +25492,7 @@
                           <pic:cNvPicPr/>
                         </pic:nvPicPr>
                         <pic:blipFill>
-                          <a:blip r:embed="rId72"/>
+                          <a:blip r:embed="rId66"/>
                           <a:stretch>
                             <a:fillRect/>
                           </a:stretch>
@@ -25658,7 +25756,7 @@
                           <pic:cNvPicPr/>
                         </pic:nvPicPr>
                         <pic:blipFill>
-                          <a:blip r:embed="rId73"/>
+                          <a:blip r:embed="rId67"/>
                           <a:stretch>
                             <a:fillRect/>
                           </a:stretch>
@@ -25934,7 +26032,7 @@
                           <pic:cNvPicPr/>
                         </pic:nvPicPr>
                         <pic:blipFill>
-                          <a:blip r:embed="rId74"/>
+                          <a:blip r:embed="rId68"/>
                           <a:stretch>
                             <a:fillRect/>
                           </a:stretch>
@@ -26196,7 +26294,7 @@
                           <pic:cNvPicPr/>
                         </pic:nvPicPr>
                         <pic:blipFill rotWithShape="1">
-                          <a:blip r:embed="rId60"/>
+                          <a:blip r:embed="rId54"/>
                           <a:srcRect l="1288" t="1807" r="1273" b="2433"/>
                           <a:stretch/>
                         </pic:blipFill>
@@ -26510,7 +26608,7 @@
                           <pic:cNvPicPr/>
                         </pic:nvPicPr>
                         <pic:blipFill>
-                          <a:blip r:embed="rId74"/>
+                          <a:blip r:embed="rId68"/>
                           <a:stretch>
                             <a:fillRect/>
                           </a:stretch>
@@ -26742,7 +26840,7 @@
       </w:r>
     </w:p>
     <w:sectPr>
-      <w:headerReference w:type="default" r:id="rId75"/>
+      <w:headerReference w:type="default" r:id="rId69"/>
       <w:pgSz w:w="12240" w:h="15840"/>
       <w:pgMar w:top="1417" w:right="1701" w:bottom="1417" w:left="1701" w:header="708" w:footer="708" w:gutter="0"/>
       <w:cols w:space="708"/>
@@ -40310,6 +40408,7 @@
   <w:style w:type="character" w:default="1" w:styleId="Fuentedeprrafopredeter">
     <w:name w:val="Default Paragraph Font"/>
     <w:uiPriority w:val="1"/>
+    <w:semiHidden/>
     <w:unhideWhenUsed/>
   </w:style>
   <w:style w:type="table" w:default="1" w:styleId="Tablanormal">

</xml_diff>